<commit_message>
docs: align overview title with TimerBoxing name
</commit_message>
<xml_diff>
--- a/Overview.docx
+++ b/Overview.docx
@@ -9,14 +9,18 @@
           <w:lang w:val="en-US"/>
         </w:rPr>
       </w:pPr>
-      <w:proofErr w:type="spellStart"/>
-      <w:r>
-        <w:rPr>
-          <w:lang w:val="en-US"/>
-        </w:rPr>
-        <w:t>BoxingTimer</w:t>
-      </w:r>
-      <w:proofErr w:type="spellEnd"/>
+      <w:r>
+        <w:rPr>
+          <w:lang w:val="en-US"/>
+        </w:rPr>
+        <w:t>Timer</w:t>
+      </w:r>
+      <w:r>
+        <w:rPr>
+          <w:lang w:val="en-US"/>
+        </w:rPr>
+        <w:t>Boxing</w:t>
+      </w:r>
     </w:p>
     <w:p>
       <w:pPr>
@@ -1125,6 +1129,7 @@
   <w:style w:type="character" w:default="1" w:styleId="a0">
     <w:name w:val="Default Paragraph Font"/>
     <w:uiPriority w:val="1"/>
+    <w:semiHidden/>
     <w:unhideWhenUsed/>
   </w:style>
   <w:style w:type="table" w:default="1" w:styleId="a1">

</xml_diff>